<commit_message>
Session 2: re-center on the Logos, trim the apologetic block
Session 2 had drifted into a defense of biblical historicity against
comparative mythology, which is a different class. Reordered so the
session answers the question it exists to answer, and moved the
historical material to a guardrail after the point is made.

- Scripture (Ecclesiastes, Acts 17) now precedes the guides
- Three apologetic slides compressed to two guardrail slides
- New slide 11, "Put it together": Pageau, Peterson, and John 1
- Slide 9 reframed as guides-not-authorities
- Discussion questions: dying-and-rising swapped for symbolic vs fictional
- Notes renumbered, timeline re-budgeted, section 7 opens with the synthesis
- Guardrail 10 and the manifest's slide references updated to match

Still 16 slides and 137 course-wide; no new images and none orphaned.

Co-Authored-By: Claude Opus 5 <noreply@anthropic.com>
</commit_message>
<xml_diff>
--- a/notes/session-02-notes.docx
+++ b/notes/session-02-notes.docx
@@ -86,7 +86,7 @@
           <w:sz w:val="22"/>
           <w:szCs w:val="22"/>
         </w:rPr>
-        <w:t xml:space="preserve">This session carries the intellectual load of the whole course. It is where the class learns why using Star Wars in Sunday school is not a gimmick, and it is where the course answers its most serious objection: that Scripture is derivative fiction assembled from older myths. Do not skip or compress slides 7, 8, and 9; they are the answer, and your teens will meet the objection online within the month.</w:t>
+        <w:t xml:space="preserve">This session carries the intellectual load of the whole course. It is where the class learns why using Star Wars in Sunday school is not a gimmick, and it is where the course states its central claim: the world outside us and the human being inside it came through the same Logos, so the patterns that keep surfacing in our stories are discovered, not invented. Slides 9 through 11 are that spine; do not let the clock eat them. Slides 12 and 13 are the historical guardrail, and they are deliberately brief. This session is not an apologetics lesson, and an imagined skeptic does not get to choose its subject.</w:t>
       </w:r>
     </w:p>
     <w:p>
@@ -157,25 +157,25 @@
           <w:sz w:val="22"/>
           <w:szCs w:val="22"/>
         </w:rPr>
-        <w:t xml:space="preserve">Practice saying Jonathan Pageau out loud before class. The name is French Canadian, roughly pa-ZHOH. Slide 12 introduces him and Jordan Peterson to the class by name, and both recur for the rest of the course, so read the block 'Who these two are, and why the class listens to them' in section 7 before you teach it.</w:t>
-      </w:r>
-    </w:p>
-    <w:p>
-      <w:pPr>
-        <w:pStyle w:val="ListParagraph"/>
-        <w:numPr>
-          <w:ilvl w:val="0"/>
-          <w:numId w:val="2"/>
-        </w:numPr>
-        <w:spacing w:after="100" w:line="290"/>
-      </w:pPr>
-      <w:r>
-        <w:rPr>
-          <w:rFonts w:ascii="Georgia" w:cs="Georgia" w:eastAsia="Georgia" w:hAnsi="Georgia"/>
-          <w:sz w:val="22"/>
-          <w:szCs w:val="22"/>
-        </w:rPr>
-        <w:t xml:space="preserve">Read section 7 of these notes (Background) carefully, especially the material on the dying-and-rising-god objection. You want that in your bones, not on a page you are reading from.</w:t>
+        <w:t xml:space="preserve">Practice saying Jonathan Pageau out loud before class. The name is French Canadian, roughly pa-ZHOH. Slide 9 introduces him and Jordan Peterson to the class by name, and both recur for the rest of the course, so read the block 'Who these two are, and why the class listens to them' in section 7 before you teach it.</w:t>
+      </w:r>
+    </w:p>
+    <w:p>
+      <w:pPr>
+        <w:pStyle w:val="ListParagraph"/>
+        <w:numPr>
+          <w:ilvl w:val="0"/>
+          <w:numId w:val="2"/>
+        </w:numPr>
+        <w:spacing w:after="100" w:line="290"/>
+      </w:pPr>
+      <w:r>
+        <w:rPr>
+          <w:rFonts w:ascii="Georgia" w:cs="Georgia" w:eastAsia="Georgia" w:hAnsi="Georgia"/>
+          <w:sz w:val="22"/>
+          <w:szCs w:val="22"/>
+        </w:rPr>
+        <w:t xml:space="preserve">Read section 7 of these notes (Background) carefully. Start with 'The synthesis: world, self, and Logos', which is the argument of the session. The derivation material that follows it is there for questions, not for the wall; know it well enough to answer warmly and briefly if it comes up.</w:t>
       </w:r>
     </w:p>
     <w:p>
@@ -256,7 +256,7 @@
           <w:sz w:val="22"/>
           <w:szCs w:val="22"/>
         </w:rPr>
-        <w:t xml:space="preserve">Realize the patterns they love did not start with the movies, and be able to answer a friend who says the Bible copied older myths.</w:t>
+        <w:t xml:space="preserve">Realize the patterns they love did not start with the movies, and be able to say why the same shapes keep turning up in stories written by people who never met.</w:t>
       </w:r>
     </w:p>
     <w:p>
@@ -284,7 +284,7 @@
           <w:sz w:val="22"/>
           <w:szCs w:val="22"/>
         </w:rPr>
-        <w:t xml:space="preserve">Gain a category for faithful engagement with culture (Paul in Athens) and a firm grip on why parallels strengthen rather than threaten the faith.</w:t>
+        <w:t xml:space="preserve">Gain a category for faithful engagement with culture (Paul in Athens) and a firm grip on why recurring patterns are what a created world should look like.</w:t>
       </w:r>
     </w:p>
     <w:p>
@@ -312,7 +312,7 @@
           <w:sz w:val="22"/>
           <w:szCs w:val="22"/>
         </w:rPr>
-        <w:t xml:space="preserve">Everyone can say why the recurrence of the pattern before and after Scripture makes the Bible more real, not less, and can explain what Lewis meant by 'myth became fact' without leaving the impression that Christ is a myth. Everyone can also say, in their own words, why this class listens to two men who are not preaching at anybody.</w:t>
+        <w:t xml:space="preserve">Everyone can summarize the session in one sentence: we keep telling the same kinds of stories because the world and the human heart were made by the same Logos, and Scripture reveals the pattern most clearly. Everyone can also explain what Lewis meant by 'myth became fact' without leaving the impression that Christ is a myth, and can say why symbolic does not mean fictional.</w:t>
       </w:r>
     </w:p>
     <w:p>
@@ -377,7 +377,7 @@
           <w:sz w:val="22"/>
           <w:szCs w:val="22"/>
         </w:rPr>
-        <w:t xml:space="preserve">The Hook: slides 2 and 3. The three descriptions that fit every story, and the puzzle of patterns written continents apart.</w:t>
+        <w:t xml:space="preserve">The Hook: slides 2 and 3. The three descriptions that fit every story, and the puzzle of patterns written continents apart. End on the question, not on an answer.</w:t>
       </w:r>
     </w:p>
     <w:p>
@@ -441,15 +441,15 @@
           <w:sz w:val="22"/>
           <w:szCs w:val="22"/>
         </w:rPr>
-        <w:t xml:space="preserve">0:25  </w:t>
-      </w:r>
-      <w:r>
-        <w:rPr>
-          <w:rFonts w:ascii="Georgia" w:cs="Georgia" w:eastAsia="Georgia" w:hAnsi="Georgia"/>
-          <w:sz w:val="22"/>
-          <w:szCs w:val="22"/>
-        </w:rPr>
-        <w:t xml:space="preserve">The Objection Answered: slides 7, 8, and 9. Did the Bible just copy the myths? Same waters, a different God. And: more real, not less. This is the heart of the session.</w:t>
+        <w:t xml:space="preserve">0:24  </w:t>
+      </w:r>
+      <w:r>
+        <w:rPr>
+          <w:rFonts w:ascii="Georgia" w:cs="Georgia" w:eastAsia="Georgia" w:hAnsi="Georgia"/>
+          <w:sz w:val="22"/>
+          <w:szCs w:val="22"/>
+        </w:rPr>
+        <w:t xml:space="preserve">Scripture: slides 7 and 8. Ecclesiastes names the ache; Acts shows what to do with the culture's stories.</w:t>
       </w:r>
     </w:p>
     <w:p>
@@ -465,15 +465,15 @@
           <w:sz w:val="22"/>
           <w:szCs w:val="22"/>
         </w:rPr>
-        <w:t xml:space="preserve">0:34  </w:t>
-      </w:r>
-      <w:r>
-        <w:rPr>
-          <w:rFonts w:ascii="Georgia" w:cs="Georgia" w:eastAsia="Georgia" w:hAnsi="Georgia"/>
-          <w:sz w:val="22"/>
-          <w:szCs w:val="22"/>
-        </w:rPr>
-        <w:t xml:space="preserve">Scripture: slides 10 and 11. Ecclesiastes names the ache; Acts shows what to do with the culture's stories.</w:t>
+        <w:t xml:space="preserve">0:32  </w:t>
+      </w:r>
+      <w:r>
+        <w:rPr>
+          <w:rFonts w:ascii="Georgia" w:cs="Georgia" w:eastAsia="Georgia" w:hAnsi="Georgia"/>
+          <w:sz w:val="22"/>
+          <w:szCs w:val="22"/>
+        </w:rPr>
+        <w:t xml:space="preserve">Our Other Two Guides: slide 9. Introduce Pageau and Peterson once, by name and by job, and set the rule that governs the rest of the course.</w:t>
       </w:r>
     </w:p>
     <w:p>
@@ -489,6 +489,30 @@
           <w:sz w:val="22"/>
           <w:szCs w:val="22"/>
         </w:rPr>
+        <w:t xml:space="preserve">0:35  </w:t>
+      </w:r>
+      <w:r>
+        <w:rPr>
+          <w:rFonts w:ascii="Georgia" w:cs="Georgia" w:eastAsia="Georgia" w:hAnsi="Georgia"/>
+          <w:sz w:val="22"/>
+          <w:szCs w:val="22"/>
+        </w:rPr>
+        <w:t xml:space="preserve">The Answer: slides 10 and 11. Why the patterns keep surfacing, and the Logos who accounts for both the world and us. This is the heart of the session.</w:t>
+      </w:r>
+    </w:p>
+    <w:p>
+      <w:pPr>
+        <w:spacing w:after="160" w:line="300"/>
+      </w:pPr>
+      <w:r>
+        <w:rPr>
+          <w:rFonts w:ascii="Georgia" w:cs="Georgia" w:eastAsia="Georgia" w:hAnsi="Georgia"/>
+          <w:b/>
+          <w:bCs/>
+          <w:color w:val="B8860B"/>
+          <w:sz w:val="22"/>
+          <w:szCs w:val="22"/>
+        </w:rPr>
         <w:t xml:space="preserve">0:41  </w:t>
       </w:r>
       <w:r>
@@ -497,7 +521,7 @@
           <w:sz w:val="22"/>
           <w:szCs w:val="22"/>
         </w:rPr>
-        <w:t xml:space="preserve">Our Other Two Guides: slide 12. Introduce Pageau and Peterson once, by name and by job, and set the rule that governs the rest of the course.</w:t>
+        <w:t xml:space="preserve">The Guardrail: slides 12 and 13. Symbolic does not mean fictional; same waters, a different God. Keep it to six minutes and do not let it expand.</w:t>
       </w:r>
     </w:p>
     <w:p>
@@ -513,15 +537,15 @@
           <w:sz w:val="22"/>
           <w:szCs w:val="22"/>
         </w:rPr>
-        <w:t xml:space="preserve">0:44  </w:t>
-      </w:r>
-      <w:r>
-        <w:rPr>
-          <w:rFonts w:ascii="Georgia" w:cs="Georgia" w:eastAsia="Georgia" w:hAnsi="Georgia"/>
-          <w:sz w:val="22"/>
-          <w:szCs w:val="22"/>
-        </w:rPr>
-        <w:t xml:space="preserve">Go Deeper: slide 13. Peterson's survival account, and why it cannot be the whole answer.</w:t>
+        <w:t xml:space="preserve">0:47  </w:t>
+      </w:r>
+      <w:r>
+        <w:rPr>
+          <w:rFonts w:ascii="Georgia" w:cs="Georgia" w:eastAsia="Georgia" w:hAnsi="Georgia"/>
+          <w:sz w:val="22"/>
+          <w:szCs w:val="22"/>
+        </w:rPr>
+        <w:t xml:space="preserve">The Landing: slide 14. The ache is homesickness.</w:t>
       </w:r>
     </w:p>
     <w:p>
@@ -537,31 +561,7 @@
           <w:sz w:val="22"/>
           <w:szCs w:val="22"/>
         </w:rPr>
-        <w:t xml:space="preserve">0:48  </w:t>
-      </w:r>
-      <w:r>
-        <w:rPr>
-          <w:rFonts w:ascii="Georgia" w:cs="Georgia" w:eastAsia="Georgia" w:hAnsi="Georgia"/>
-          <w:sz w:val="22"/>
-          <w:szCs w:val="22"/>
-        </w:rPr>
-        <w:t xml:space="preserve">The Landing: slide 14. The ache is homesickness.</w:t>
-      </w:r>
-    </w:p>
-    <w:p>
-      <w:pPr>
-        <w:spacing w:after="160" w:line="300"/>
-      </w:pPr>
-      <w:r>
-        <w:rPr>
-          <w:rFonts w:ascii="Georgia" w:cs="Georgia" w:eastAsia="Georgia" w:hAnsi="Georgia"/>
-          <w:b/>
-          <w:bCs/>
-          <w:color w:val="B8860B"/>
-          <w:sz w:val="22"/>
-          <w:szCs w:val="22"/>
-        </w:rPr>
-        <w:t xml:space="preserve">0:51  </w:t>
+        <w:t xml:space="preserve">0:50  </w:t>
       </w:r>
       <w:r>
         <w:rPr>
@@ -656,7 +656,7 @@
           <w:sz w:val="22"/>
           <w:szCs w:val="22"/>
         </w:rPr>
-        <w:t xml:space="preserve">Stress the geography and the centuries. Flood narratives in Mesopotamia, India, China; dragon slayers everywhere. Lay out the three explanations honestly: coincidence, copying, or a pattern in reality. Tell them plainly you will come back and deal with 'copying' head-on in a few minutes; do not resolve it yet.</w:t>
+        <w:t xml:space="preserve">Stress the geography and the centuries. Flood narratives in Mesopotamia, India, China; dragon slayers everywhere; sacrifice and descent and return told long before Bethlehem. Lay the three possible explanations on the table out loud, honestly and without hurrying past any of them: coincidence, copying, or a pattern woven into the world itself. Say them and then stop. Do not resolve it, and do not start defending anything; the slide deliberately leaves the question open, and the answer arrives on slides 10 and 11 as a discovery rather than a rebuttal. The room should be curious here, not braced. (Session 5 comes back to this same trio when the monsters turn up everywhere too.)</w:t>
       </w:r>
     </w:p>
     <w:p>
@@ -725,168 +725,168 @@
           <w:sz w:val="22"/>
           <w:szCs w:val="22"/>
         </w:rPr>
-        <w:t xml:space="preserve">Define the word before you use it, because the room will hear the modern meaning. Say something like: when Lewis says myth he does not mean a falsehood, he means what a literature professor means, a story of enormous shape and power, whether or not it happened. Only then read his line aloud, slowly, from the letter to Arthur Greeves: 'The story of Christ is simply a true myth: a myth working on us in the same way as the others, but with this tremendous difference that it really happened.' Point out that Lewis's 'simply' means 'precisely', not 'merely'. The claim is not that the gospel is like a myth; it is that the thing the myths reach for actually entered history. The slide states the guard for you: Christ is not a myth, and what every myth was groping toward walked out of a tomb. Tolkien's word for the joyous turn is eucatastrophe; he called the resurrection the great eucatastrophe of human history.</w:t>
-      </w:r>
-    </w:p>
-    <w:p>
-      <w:pPr>
-        <w:spacing w:after="160" w:line="300"/>
-      </w:pPr>
-      <w:r>
-        <w:rPr>
-          <w:rFonts w:ascii="Georgia" w:cs="Georgia" w:eastAsia="Georgia" w:hAnsi="Georgia"/>
-          <w:b/>
-          <w:bCs/>
-          <w:sz w:val="22"/>
-          <w:szCs w:val="22"/>
-        </w:rPr>
-        <w:t xml:space="preserve">Slide 7 (So the Bible just copied the older myths?): </w:t>
-      </w:r>
-      <w:r>
-        <w:rPr>
-          <w:rFonts w:ascii="Georgia" w:cs="Georgia" w:eastAsia="Georgia" w:hAnsi="Georgia"/>
-          <w:sz w:val="22"/>
-          <w:szCs w:val="22"/>
-        </w:rPr>
-        <w:t xml:space="preserve">THE KEY SLIDE OF THE SESSION. Voice the objection in its strongest form first, in your own words, without flinching: there are flood stories older than Genesis, and dying-and-rising figures told before Bethlehem; skeptics conclude Scripture is a late remix. Then concede the dates out loud, and concede them cheerfully. Yes, the Gilgamesh tablets were written down before Moses set Genesis in order. Saying so costs us nothing, and going quiet on it looks like evasion to a teenager who has already read the argument online. The question was never which clay is oldest. It is what happened, and who tells it straight. Turn it with the two images on the slide: an echo does not create the sound, a shadow does not cast the man. Then give them the positive evidence, which is the real work of this slide. Nearly every people on earth remembers the waters. Babylon and Greece, India and China, the Americas, the islands of the Pacific: peoples who never met and could not have compared notes, all recalling a catastrophe survived by a remnant. That is not one story copied down a line. That is a world remembering something it lived through. One caution about what you claim here. The shared human memory of a flood is strong ground and it is all you need. Do not tell the room that geology has settled the question of a single worldwide flood, because that is genuinely contested, and a student with a phone will find the counterargument before you finish the sentence. Stand on the memory and on the authority of the account, not on a scientific consensus that is not there.</w:t>
-      </w:r>
-    </w:p>
-    <w:p>
-      <w:pPr>
-        <w:spacing w:after="160" w:line="300"/>
-      </w:pPr>
-      <w:r>
-        <w:rPr>
-          <w:rFonts w:ascii="Georgia" w:cs="Georgia" w:eastAsia="Georgia" w:hAnsi="Georgia"/>
-          <w:b/>
-          <w:bCs/>
-          <w:sz w:val="22"/>
-          <w:szCs w:val="22"/>
-        </w:rPr>
-        <w:t xml:space="preserve">Slide 8 (Same waters. A different God.): </w:t>
-      </w:r>
-      <w:r>
-        <w:rPr>
-          <w:rFonts w:ascii="Georgia" w:cs="Georgia" w:eastAsia="Georgia" w:hAnsi="Georgia"/>
-          <w:sz w:val="22"/>
-          <w:szCs w:val="22"/>
-        </w:rPr>
-        <w:t xml:space="preserve">This is the slide that keeps Genesis from becoming one of several, so do not hurry it. Read the contrast slowly, because it does more work than any argument on the slide before it. In Gilgamesh the gods send the flood because human beings have grown noisy and inconvenient, and afterward they squabble over the survivor. In Genesis the flood is the moral judgment of a righteous God against real evil, and it ends with that God binding himself by covenant never to do it again. Same event remembered; a radically different account of who God is. Then state the authority claim plainly. Genesis is not the last entry in a list of flood stories. It is the account God gave to Moses of the thing the whole world was still half remembering. The other tellings are witnesses that something happened; Scripture is testimony to who was in it. If someone asks how Moses could know, give them the answer this class will need all year: he was told. Revelation, not research. That is the authority the tablets never had, and it is why their age was never a threat. Say plainly that the other accounts are not rivals to Genesis and not its sources either. They are the rest of the world talking in its sleep about something real. Scripture is the one account given by the One who was there.</w:t>
-      </w:r>
-    </w:p>
-    <w:p>
-      <w:pPr>
-        <w:spacing w:after="160" w:line="300"/>
-      </w:pPr>
-      <w:r>
-        <w:rPr>
-          <w:rFonts w:ascii="Georgia" w:cs="Georgia" w:eastAsia="Georgia" w:hAnsi="Georgia"/>
-          <w:b/>
-          <w:bCs/>
-          <w:sz w:val="22"/>
-          <w:szCs w:val="22"/>
-        </w:rPr>
-        <w:t xml:space="preserve">Slide 9 (More real, not less): </w:t>
-      </w:r>
-      <w:r>
-        <w:rPr>
-          <w:rFonts w:ascii="Georgia" w:cs="Georgia" w:eastAsia="Georgia" w:hAnsi="Georgia"/>
-          <w:sz w:val="22"/>
-          <w:szCs w:val="22"/>
-        </w:rPr>
-        <w:t xml:space="preserve">State the positive claim slowly and let it land: the parallels do not dilute Scripture, they corroborate it. Everywhere else the pattern is a rumor, a dream, a longing. Here it has an address. Name the specifics deliberately: a named place, a dated day, a governor whose name is in secular records, witnesses who could be cross-examined and who mostly died refusing to recant. This is the difference between a myth about a dying god and a Roman execution with a body count of one and a tomb the authorities could have opened. Say it clearly: the events of Scripture are actual events. We do not treat them as symbols that happen to be moving. We treat them as history that happens to be shaped like the deepest longing of the human race, which is exactly what you would expect if the Author of the human race arranged both.</w:t>
-      </w:r>
-    </w:p>
-    <w:p>
-      <w:pPr>
-        <w:spacing w:after="160" w:line="300"/>
-      </w:pPr>
-      <w:r>
-        <w:rPr>
-          <w:rFonts w:ascii="Georgia" w:cs="Georgia" w:eastAsia="Georgia" w:hAnsi="Georgia"/>
-          <w:b/>
-          <w:bCs/>
-          <w:sz w:val="22"/>
-          <w:szCs w:val="22"/>
-        </w:rPr>
-        <w:t xml:space="preserve">Slide 10 (Ecclesiastes 3:11): </w:t>
-      </w:r>
-      <w:r>
-        <w:rPr>
-          <w:rFonts w:ascii="Georgia" w:cs="Georgia" w:eastAsia="Georgia" w:hAnsi="Georgia"/>
-          <w:sz w:val="22"/>
-          <w:szCs w:val="22"/>
-        </w:rPr>
-        <w:t xml:space="preserve">Eternity in the heart is why no earthly good ever quite satisfies, and why the credits roll and the ache remains. Solomon diagnosed the condition the stories keep touching.</w:t>
-      </w:r>
-    </w:p>
-    <w:p>
-      <w:pPr>
-        <w:spacing w:after="160" w:line="300"/>
-      </w:pPr>
-      <w:r>
-        <w:rPr>
-          <w:rFonts w:ascii="Georgia" w:cs="Georgia" w:eastAsia="Georgia" w:hAnsi="Georgia"/>
-          <w:b/>
-          <w:bCs/>
-          <w:sz w:val="22"/>
-          <w:szCs w:val="22"/>
-        </w:rPr>
-        <w:t xml:space="preserve">Slide 11 (Acts 17): </w:t>
-      </w:r>
-      <w:r>
-        <w:rPr>
-          <w:rFonts w:ascii="Georgia" w:cs="Georgia" w:eastAsia="Georgia" w:hAnsi="Georgia"/>
-          <w:sz w:val="22"/>
-          <w:szCs w:val="22"/>
-        </w:rPr>
-        <w:t xml:space="preserve">Paul is provoked by the idols, but his method is not demolition; he finds the altar to the unknown god and the lines from their own poets, and he preaches Christ from inside their longing. This is the course's warrant for using Star Wars in Sunday school. Note too that Paul does not argue the resurrection is a beautiful idea; he ends on the fact of it (v. 31), and the crowd splits over that, not over the poetry.</w:t>
-      </w:r>
-    </w:p>
-    <w:p>
-      <w:pPr>
-        <w:spacing w:after="160" w:line="300"/>
-      </w:pPr>
-      <w:r>
-        <w:rPr>
-          <w:rFonts w:ascii="Georgia" w:cs="Georgia" w:eastAsia="Georgia" w:hAnsi="Georgia"/>
-          <w:b/>
-          <w:bCs/>
-          <w:sz w:val="22"/>
-          <w:szCs w:val="22"/>
-        </w:rPr>
-        <w:t xml:space="preserve">Slide 12 (Our other two guides): </w:t>
-      </w:r>
-      <w:r>
-        <w:rPr>
-          <w:rFonts w:ascii="Georgia" w:cs="Georgia" w:eastAsia="Georgia" w:hAnsi="Georgia"/>
-          <w:sz w:val="22"/>
-          <w:szCs w:val="22"/>
-        </w:rPr>
-        <w:t xml:space="preserve">Three minutes, and do not let it become biography. Give each man his job. Jonathan Pageau (pa-ZHOH) is an Orthodox Christian who carves icons and studies symbolism, and he supplies this course with its picture of a patterned reality. Jordan Peterson is a clinical psychologist who spent a career on why human beings navigate by story, and he supplies the picture of order and chaos. Then say the sentence that pays off for the next nine weeks: neither of them is preaching at you, and that is exactly why their agreement is worth something. A friendly witness who wants you to believe is easy to discount; a witness with no such interest, sketching the same shape, is harder to wave away. Close with the guardrail printed on the slide: we borrow their maps gladly, and we do not read them as Scripture. If a name lands loaded in the room, see the pastoral note in section 8 and keep moving.</w:t>
-      </w:r>
-    </w:p>
-    <w:p>
-      <w:pPr>
-        <w:spacing w:after="160" w:line="300"/>
-      </w:pPr>
-      <w:r>
-        <w:rPr>
-          <w:rFonts w:ascii="Georgia" w:cs="Georgia" w:eastAsia="Georgia" w:hAnsi="Georgia"/>
-          <w:b/>
-          <w:bCs/>
-          <w:sz w:val="22"/>
-          <w:szCs w:val="22"/>
-        </w:rPr>
-        <w:t xml:space="preserve">Slide 13 (Go deeper): </w:t>
-      </w:r>
-      <w:r>
-        <w:rPr>
-          <w:rFonts w:ascii="Georgia" w:cs="Georgia" w:eastAsia="Georgia" w:hAnsi="Georgia"/>
-          <w:sz w:val="22"/>
-          <w:szCs w:val="22"/>
-        </w:rPr>
-        <w:t xml:space="preserve">Present Peterson's survival account fairly; it is genuinely powerful and the slide now says so without hedging. Stories are distilled, tested maps. Then press the question it cannot answer: why does the map produce longing? Usefulness explains survival; it does not explain homesickness. Add Lewis's 'good dreams' and the line on the slide: if the myths had said nothing like the gospel, THAT would be the strange thing. A God preparing a world for an incarnation would be expected to seed the imagination first.</w:t>
+        <w:t xml:space="preserve">Define the word before you use it, because the room will hear the modern meaning. Say something like: when Lewis says myth he does not mean a falsehood, he means what a literature professor means, a story of enormous shape and power, whether or not it happened. Only then read his line aloud, slowly, from the letter to Arthur Greeves: 'The story of Christ is simply a true myth: a myth working on us in the same way as the others, but with this tremendous difference that it really happened.' Point out that Lewis's 'simply' means 'precisely', not 'merely'. The claim is not that the gospel is like a myth; it is that the thing the myths reach for actually entered history. Tolkien's word for the joyous turn is eucatastrophe; he called the resurrection the great eucatastrophe of human history.</w:t>
+      </w:r>
+    </w:p>
+    <w:p>
+      <w:pPr>
+        <w:spacing w:after="160" w:line="300"/>
+      </w:pPr>
+      <w:r>
+        <w:rPr>
+          <w:rFonts w:ascii="Georgia" w:cs="Georgia" w:eastAsia="Georgia" w:hAnsi="Georgia"/>
+          <w:b/>
+          <w:bCs/>
+          <w:sz w:val="22"/>
+          <w:szCs w:val="22"/>
+        </w:rPr>
+        <w:t xml:space="preserve">Slide 7 (Ecclesiastes 3:11): </w:t>
+      </w:r>
+      <w:r>
+        <w:rPr>
+          <w:rFonts w:ascii="Georgia" w:cs="Georgia" w:eastAsia="Georgia" w:hAnsi="Georgia"/>
+          <w:sz w:val="22"/>
+          <w:szCs w:val="22"/>
+        </w:rPr>
+        <w:t xml:space="preserve">Eternity in the heart is why no earthly good ever quite satisfies, and why the credits roll and the ache remains. Solomon diagnosed the condition the stories keep touching, three thousand years before anyone had a word for archetypes.</w:t>
+      </w:r>
+    </w:p>
+    <w:p>
+      <w:pPr>
+        <w:spacing w:after="160" w:line="300"/>
+      </w:pPr>
+      <w:r>
+        <w:rPr>
+          <w:rFonts w:ascii="Georgia" w:cs="Georgia" w:eastAsia="Georgia" w:hAnsi="Georgia"/>
+          <w:b/>
+          <w:bCs/>
+          <w:sz w:val="22"/>
+          <w:szCs w:val="22"/>
+        </w:rPr>
+        <w:t xml:space="preserve">Slide 8 (Acts 17): </w:t>
+      </w:r>
+      <w:r>
+        <w:rPr>
+          <w:rFonts w:ascii="Georgia" w:cs="Georgia" w:eastAsia="Georgia" w:hAnsi="Georgia"/>
+          <w:sz w:val="22"/>
+          <w:szCs w:val="22"/>
+        </w:rPr>
+        <w:t xml:space="preserve">Paul is provoked by the idols, but his method is not demolition; he finds the altar to the unknown god and the lines from their own poets, and he preaches Christ from inside their longing. This is the course's warrant for using Star Wars in Sunday school: partial truth recognized, then redirected toward the God they do not yet know. Note too that Paul does not argue the resurrection is a beautiful idea; he ends on the fact of it (v. 31), and the crowd splits over that, not over the poetry.</w:t>
+      </w:r>
+    </w:p>
+    <w:p>
+      <w:pPr>
+        <w:spacing w:after="160" w:line="300"/>
+      </w:pPr>
+      <w:r>
+        <w:rPr>
+          <w:rFonts w:ascii="Georgia" w:cs="Georgia" w:eastAsia="Georgia" w:hAnsi="Georgia"/>
+          <w:b/>
+          <w:bCs/>
+          <w:sz w:val="22"/>
+          <w:szCs w:val="22"/>
+        </w:rPr>
+        <w:t xml:space="preserve">Slide 9 (Our other two guides): </w:t>
+      </w:r>
+      <w:r>
+        <w:rPr>
+          <w:rFonts w:ascii="Georgia" w:cs="Georgia" w:eastAsia="Georgia" w:hAnsi="Georgia"/>
+          <w:sz w:val="22"/>
+          <w:szCs w:val="22"/>
+        </w:rPr>
+        <w:t xml:space="preserve">Three minutes, and do not let it become biography. Give each man one job and say it in one sentence. Jonathan Pageau (pa-ZHOH) is an Orthodox Christian who carves icons and studies symbolism: the pattern is in the world. Jordan Peterson is a clinical psychologist who spent a career on why human beings navigate by story: the pattern is in us. Then say the guardrail printed on the slide, and say it plainly rather than apologetically: we use both men as guides, not authorities, and Scripture remains our measure for both. Pageau is a brother in Christ from another tradition; Peterson reaches the pattern from outside the faith, which is part of why his observations are worth hearing. Neither one is the foundation of anything here. If a name lands loaded in the room, see the pastoral note in section 8 and keep moving.</w:t>
+      </w:r>
+    </w:p>
+    <w:p>
+      <w:pPr>
+        <w:spacing w:after="160" w:line="300"/>
+      </w:pPr>
+      <w:r>
+        <w:rPr>
+          <w:rFonts w:ascii="Georgia" w:cs="Georgia" w:eastAsia="Georgia" w:hAnsi="Georgia"/>
+          <w:b/>
+          <w:bCs/>
+          <w:sz w:val="22"/>
+          <w:szCs w:val="22"/>
+        </w:rPr>
+        <w:t xml:space="preserve">Slide 10 (Go deeper): </w:t>
+      </w:r>
+      <w:r>
+        <w:rPr>
+          <w:rFonts w:ascii="Georgia" w:cs="Georgia" w:eastAsia="Georgia" w:hAnsi="Georgia"/>
+          <w:sz w:val="22"/>
+          <w:szCs w:val="22"/>
+        </w:rPr>
+        <w:t xml:space="preserve">Four voices, one question, in this order. Peterson: the surviving stories are distilled maps for living, and the useless ones died out. Present that fairly; it is genuinely powerful. Pageau: the maps work because the patterns are not only in our heads, and reality itself is meaningfully structured. Lewis and Tolkien: our imagining echoes the Creator because we are creatures made in his image, and 'we make still by the law in which we're made.' John: all things were made through the Logos. Land on the last line and let it sit: we do not invent these patterns out of nothing, we keep discovering them.</w:t>
+      </w:r>
+    </w:p>
+    <w:p>
+      <w:pPr>
+        <w:spacing w:after="160" w:line="300"/>
+      </w:pPr>
+      <w:r>
+        <w:rPr>
+          <w:rFonts w:ascii="Georgia" w:cs="Georgia" w:eastAsia="Georgia" w:hAnsi="Georgia"/>
+          <w:b/>
+          <w:bCs/>
+          <w:sz w:val="22"/>
+          <w:szCs w:val="22"/>
+        </w:rPr>
+        <w:t xml:space="preserve">Slide 11 (Put it together): </w:t>
+      </w:r>
+      <w:r>
+        <w:rPr>
+          <w:rFonts w:ascii="Georgia" w:cs="Georgia" w:eastAsia="Georgia" w:hAnsi="Georgia"/>
+          <w:sz w:val="22"/>
+          <w:szCs w:val="22"/>
+        </w:rPr>
+        <w:t xml:space="preserve">THE KEY SLIDE OF THE SESSION. Everything before it has been assembling this sentence, so slow down and do not rush into the guardrail that follows. The two observations are not rivals and you do not have to choose between them. If the same God made the sea and made the mind that stands at the shore, then of course the structure of the one answers to the structure of the other. Read John 1:3 aloud. Then say the payoff out loud: the recurring patterns are not a coincidence that needs explaining away, they are exactly what a created world should look like from the inside. This is the sentence that unlocks sessions 3 through 11, and it is the one you want a student to be able to repeat on the way to the car.</w:t>
+      </w:r>
+    </w:p>
+    <w:p>
+      <w:pPr>
+        <w:spacing w:after="160" w:line="300"/>
+      </w:pPr>
+      <w:r>
+        <w:rPr>
+          <w:rFonts w:ascii="Georgia" w:cs="Georgia" w:eastAsia="Georgia" w:hAnsi="Georgia"/>
+          <w:b/>
+          <w:bCs/>
+          <w:sz w:val="22"/>
+          <w:szCs w:val="22"/>
+        </w:rPr>
+        <w:t xml:space="preserve">Slide 12 (Pattern is not the opposite of history): </w:t>
+      </w:r>
+      <w:r>
+        <w:rPr>
+          <w:rFonts w:ascii="Georgia" w:cs="Georgia" w:eastAsia="Georgia" w:hAnsi="Georgia"/>
+          <w:sz w:val="22"/>
+          <w:szCs w:val="22"/>
+        </w:rPr>
+        <w:t xml:space="preserve">The guardrail, first movement. The modern ear hears 'symbolic' and thinks 'so it did not really happen.' Break that equation directly, because the whole rest of the course depends on it. Symbolic describes the larger pattern a thing takes part in; it says nothing about whether the thing occurred. Walk the three examples on the slide and let each one be both at once: David really faced Goliath and really is the small faithful center against monstrous chaos; Jonah really went down into the deep and the descent really is the shape of death and return; Christ was really crucified and raised, and that event is where every biblical pattern of sacrifice, descent, and victory converges. Then the landing, which is the guardrail in one sentence: Christianity does not claim only that the pattern is meaningful, it claims that in Jesus Christ the pattern entered history.</w:t>
+      </w:r>
+    </w:p>
+    <w:p>
+      <w:pPr>
+        <w:spacing w:after="160" w:line="300"/>
+      </w:pPr>
+      <w:r>
+        <w:rPr>
+          <w:rFonts w:ascii="Georgia" w:cs="Georgia" w:eastAsia="Georgia" w:hAnsi="Georgia"/>
+          <w:b/>
+          <w:bCs/>
+          <w:sz w:val="22"/>
+          <w:szCs w:val="22"/>
+        </w:rPr>
+        <w:t xml:space="preserve">Slide 13 (Same waters. A different God.): </w:t>
+      </w:r>
+      <w:r>
+        <w:rPr>
+          <w:rFonts w:ascii="Georgia" w:cs="Georgia" w:eastAsia="Georgia" w:hAnsi="Georgia"/>
+          <w:sz w:val="22"/>
+          <w:szCs w:val="22"/>
+        </w:rPr>
+        <w:t xml:space="preserve">The guardrail, second movement, and the last word on the subject in this session. Concede the dates cheerfully and in one breath: yes, the Gilgamesh tablets were written down before Moses set Genesis in order, and it costs us nothing, because an echo does not create the sound. Then move immediately to what the accounts actually say, which is where the real work is. In Gilgamesh the gods send the flood because human beings have grown noisy and inconvenient, and afterward they squabble over the survivor. In Genesis the flood is the moral judgment of a righteous God who then binds himself by covenant never to repeat it. Same event remembered; a radically different account of who God is. Close with the authority claim: the other tellings are witnesses that something happened, Scripture is testimony to who was in it, given by the One who was there. If someone asks how Moses could know, the answer is revelation, not research. One caution about what you claim here: rest on the shared human memory and on the authority of the account, and do not tell the room that geology has settled the question of a single worldwide flood. That is genuinely contested, and a student with a phone will find the counterargument before you finish the sentence. If the room wants to argue comparative mythology, offer to talk afterward and move on. The material in section 7 is there for exactly that conversation.</w:t>
       </w:r>
     </w:p>
     <w:p>
@@ -932,7 +932,7 @@
           <w:sz w:val="22"/>
           <w:szCs w:val="22"/>
         </w:rPr>
-        <w:t xml:space="preserve">Five questions this week, more than any other session, and you are not meant to use them all. Open with the first Starter and answer it yourself first, briefly, using the story you prepared; the room will match the depth you model. Then protect time for the last Deeper question, the dying-and-rising-god objection, because it is the one a teenager will actually meet in a dorm room or a comment thread. Push the room past 'that is offensive' to an actual answer, and let them assemble it from the session: chronology of tellings is not chronology of truth, the parallels are overstated, the Gospels do not read like myth, and an echo does not create the sound.</w:t>
+        <w:t xml:space="preserve">Five questions this week, and you are not meant to use them all. Open with the first Starter and answer it yourself first, briefly, using the story you prepared; the room will match the depth you model. Protect time for the last Deeper question, on the difference between symbolic and fictional, because it is where the session's guardrail becomes theirs rather than yours. Watch for two drifts: a room that wants to relitigate comparative mythology, and a room that treats the patterns as a clever theory rather than a claim about reality. Pull both back to the sentence from slide 11.</w:t>
       </w:r>
     </w:p>
     <w:p>
@@ -955,7 +955,7 @@
           <w:sz w:val="22"/>
           <w:szCs w:val="22"/>
         </w:rPr>
-        <w:t xml:space="preserve">The stories ring true because Someone struck the bell. Tie it to the bell image from slide 7: one strike, many echoes, near and far, before and after. Close in prayer, perhaps thanking God for being the Author who wrote himself into the story.</w:t>
+        <w:t xml:space="preserve">The stories ring true because Someone struck the bell. Tie it to the bell image from slide 12: one strike, many echoes, near and far, before and after. Close in prayer, perhaps thanking God for being the Author who wrote himself into the story.</w:t>
       </w:r>
     </w:p>
     <w:p>
@@ -1099,7 +1099,7 @@
           <w:sz w:val="22"/>
           <w:szCs w:val="22"/>
         </w:rPr>
-        <w:t xml:space="preserve">For we did not follow cleverly devised stories when we told you about the coming of our Lord Jesus Christ in power, but we were eyewitnesses of his majesty.</w:t>
+        <w:t xml:space="preserve">In the beginning was the Word, and the Word was with God, and the Word was God. He was with God in the beginning. Through him all things were made; without him nothing was made that has been made.</w:t>
       </w:r>
     </w:p>
     <w:p>
@@ -1116,6 +1116,42 @@
           <w:sz w:val="20"/>
           <w:szCs w:val="20"/>
         </w:rPr>
+        <w:t xml:space="preserve">John 1:1-3</w:t>
+      </w:r>
+    </w:p>
+    <w:p>
+      <w:pPr>
+        <w:pBdr>
+          <w:left w:val="single" w:color="B8860B" w:sz="12" w:space="12"/>
+        </w:pBdr>
+        <w:spacing w:after="60" w:line="320"/>
+        <w:ind w:left="576" w:right="431"/>
+      </w:pPr>
+      <w:r>
+        <w:rPr>
+          <w:rFonts w:ascii="Georgia" w:cs="Georgia" w:eastAsia="Georgia" w:hAnsi="Georgia"/>
+          <w:i/>
+          <w:iCs/>
+          <w:sz w:val="22"/>
+          <w:szCs w:val="22"/>
+        </w:rPr>
+        <w:t xml:space="preserve">For we did not follow cleverly devised stories when we told you about the coming of our Lord Jesus Christ in power, but we were eyewitnesses of his majesty.</w:t>
+      </w:r>
+    </w:p>
+    <w:p>
+      <w:pPr>
+        <w:spacing w:after="200"/>
+        <w:ind w:left="576"/>
+      </w:pPr>
+      <w:r>
+        <w:rPr>
+          <w:rFonts w:ascii="Georgia" w:cs="Georgia" w:eastAsia="Georgia" w:hAnsi="Georgia"/>
+          <w:b/>
+          <w:bCs/>
+          <w:color w:val="B8860B"/>
+          <w:sz w:val="20"/>
+          <w:szCs w:val="20"/>
+        </w:rPr>
         <w:t xml:space="preserve">2 Peter 1:16</w:t>
       </w:r>
     </w:p>
@@ -1186,25 +1222,7 @@
           <w:sz w:val="22"/>
           <w:szCs w:val="22"/>
         </w:rPr>
-        <w:t xml:space="preserve">Name a pattern you have spotted in three unrelated stories.</w:t>
-      </w:r>
-    </w:p>
-    <w:p>
-      <w:pPr>
-        <w:pStyle w:val="ListParagraph"/>
-        <w:numPr>
-          <w:ilvl w:val="0"/>
-          <w:numId w:val="2"/>
-        </w:numPr>
-        <w:spacing w:after="100" w:line="290"/>
-      </w:pPr>
-      <w:r>
-        <w:rPr>
-          <w:rFonts w:ascii="Georgia" w:cs="Georgia" w:eastAsia="Georgia" w:hAnsi="Georgia"/>
-          <w:sz w:val="22"/>
-          <w:szCs w:val="22"/>
-        </w:rPr>
-        <w:t xml:space="preserve">If the same story keeps getting told across every culture, what are the possible explanations?</w:t>
+        <w:t xml:space="preserve">Name a pattern you have seen in three stories whose authors could not have copied one another.</w:t>
       </w:r>
     </w:p>
     <w:p>
@@ -1239,6 +1257,42 @@
           <w:sz w:val="22"/>
           <w:szCs w:val="22"/>
         </w:rPr>
+        <w:t xml:space="preserve">If the same patterns turn up in Scripture, ancient stories, modern movies, and ordinary life, what are the possible explanations?</w:t>
+      </w:r>
+    </w:p>
+    <w:p>
+      <w:pPr>
+        <w:pStyle w:val="ListParagraph"/>
+        <w:numPr>
+          <w:ilvl w:val="0"/>
+          <w:numId w:val="2"/>
+        </w:numPr>
+        <w:spacing w:after="100" w:line="290"/>
+      </w:pPr>
+      <w:r>
+        <w:rPr>
+          <w:rFonts w:ascii="Georgia" w:cs="Georgia" w:eastAsia="Georgia" w:hAnsi="Georgia"/>
+          <w:sz w:val="22"/>
+          <w:szCs w:val="22"/>
+        </w:rPr>
+        <w:t xml:space="preserve">What changes if those patterns are not inventions of the human mind but features of the reality God created?</w:t>
+      </w:r>
+    </w:p>
+    <w:p>
+      <w:pPr>
+        <w:pStyle w:val="ListParagraph"/>
+        <w:numPr>
+          <w:ilvl w:val="0"/>
+          <w:numId w:val="2"/>
+        </w:numPr>
+        <w:spacing w:after="100" w:line="290"/>
+      </w:pPr>
+      <w:r>
+        <w:rPr>
+          <w:rFonts w:ascii="Georgia" w:cs="Georgia" w:eastAsia="Georgia" w:hAnsi="Georgia"/>
+          <w:sz w:val="22"/>
+          <w:szCs w:val="22"/>
+        </w:rPr>
         <w:t xml:space="preserve">'Eternity in the human heart.' Where do you feel that most: music, stories, nature, grief, worship?</w:t>
       </w:r>
     </w:p>
@@ -1275,25 +1329,7 @@
           <w:sz w:val="22"/>
           <w:szCs w:val="22"/>
         </w:rPr>
-        <w:t xml:space="preserve">Someone tells you the resurrection is just another dying-and-rising god story. What do you say? (Push the room past 'that is offensive' to an actual answer.)</w:t>
-      </w:r>
-    </w:p>
-    <w:p>
-      <w:pPr>
-        <w:pStyle w:val="ListParagraph"/>
-        <w:numPr>
-          <w:ilvl w:val="0"/>
-          <w:numId w:val="2"/>
-        </w:numPr>
-        <w:spacing w:after="100" w:line="290"/>
-      </w:pPr>
-      <w:r>
-        <w:rPr>
-          <w:rFonts w:ascii="Georgia" w:cs="Georgia" w:eastAsia="Georgia" w:hAnsi="Georgia"/>
-          <w:sz w:val="22"/>
-          <w:szCs w:val="22"/>
-        </w:rPr>
-        <w:t xml:space="preserve">Lewis said the old myths were reaching for something that finally happened in history. Why does the 'really happened' part matter so much? What would we lose without it?</w:t>
+        <w:t xml:space="preserve">What is the difference between saying an event is symbolic and saying an event is fictional?</w:t>
       </w:r>
     </w:p>
     <w:p>
@@ -1327,146 +1363,79 @@
           <w:sz w:val="26"/>
           <w:szCs w:val="26"/>
         </w:rPr>
-        <w:t xml:space="preserve">The derivation objection, handled properly</w:t>
-      </w:r>
-    </w:p>
-    <w:p>
-      <w:pPr>
-        <w:spacing w:after="160" w:line="300"/>
-      </w:pPr>
-      <w:r>
-        <w:rPr>
-          <w:rFonts w:ascii="Georgia" w:cs="Georgia" w:eastAsia="Georgia" w:hAnsi="Georgia"/>
-          <w:sz w:val="22"/>
-          <w:szCs w:val="22"/>
-        </w:rPr>
-        <w:t xml:space="preserve">This is the material behind slides 7, 8, and 9. Know it well enough to teach it conversationally.</w:t>
-      </w:r>
-    </w:p>
-    <w:p>
-      <w:pPr>
-        <w:pStyle w:val="ListParagraph"/>
-        <w:numPr>
-          <w:ilvl w:val="0"/>
-          <w:numId w:val="2"/>
-        </w:numPr>
-        <w:spacing w:after="100" w:line="290"/>
-      </w:pPr>
-      <w:r>
-        <w:rPr>
-          <w:rFonts w:ascii="Georgia" w:cs="Georgia" w:eastAsia="Georgia" w:hAnsi="Georgia"/>
-          <w:sz w:val="22"/>
-          <w:szCs w:val="22"/>
-        </w:rPr>
-        <w:t xml:space="preserve">The objection in its popular form: Genesis borrowed its flood from Gilgamesh; the resurrection borrowed from Osiris, Adonis, Attis, Mithras, Dionysus; therefore Christianity is a late remix of pagan material. It circulates constantly online and in documentaries.</w:t>
-      </w:r>
-    </w:p>
-    <w:p>
-      <w:pPr>
-        <w:pStyle w:val="ListParagraph"/>
-        <w:numPr>
-          <w:ilvl w:val="0"/>
-          <w:numId w:val="2"/>
-        </w:numPr>
-        <w:spacing w:after="100" w:line="290"/>
-      </w:pPr>
-      <w:r>
-        <w:rPr>
-          <w:rFonts w:ascii="Georgia" w:cs="Georgia" w:eastAsia="Georgia" w:hAnsi="Georgia"/>
-          <w:sz w:val="22"/>
-          <w:szCs w:val="22"/>
-        </w:rPr>
-        <w:t xml:space="preserve">First answer, the logical one: chronology of tellings is not chronology of truth. That an idea was voiced before an event does not mean the event did not happen. Rumors of a king precede a coronation; sketches precede a portrait; an echo does not create the sound. If God built reality with a certain shape, we should expect humans made in his image to keep sketching that shape long before and long after the events.</w:t>
-      </w:r>
-    </w:p>
-    <w:p>
-      <w:pPr>
-        <w:pStyle w:val="ListParagraph"/>
-        <w:numPr>
-          <w:ilvl w:val="0"/>
-          <w:numId w:val="2"/>
-        </w:numPr>
-        <w:spacing w:after="100" w:line="290"/>
-      </w:pPr>
-      <w:r>
-        <w:rPr>
-          <w:rFonts w:ascii="Georgia" w:cs="Georgia" w:eastAsia="Georgia" w:hAnsi="Georgia"/>
-          <w:sz w:val="22"/>
-          <w:szCs w:val="22"/>
-        </w:rPr>
-        <w:t xml:space="preserve">Second answer, the evidential one: the alleged parallels are routinely overstated. Serious scholarship, including work by non-Christians (Jonathan Z. Smith's critique of the 'dying and rising gods' category is the standard reference; also relevant is the collapse of the older Frazer/Golden Bough synthesis), has shown that most of these figures do not actually die and rise in anything like the Christian sense; several 'parallels' derive from post-Christian sources or from loose paraphrase. Encourage anyone pressing this to check primary sources rather than internet lists. You need not be combative; just note that the parallels tend to shrink dramatically under examination.</w:t>
-      </w:r>
-    </w:p>
-    <w:p>
-      <w:pPr>
-        <w:pStyle w:val="ListParagraph"/>
-        <w:numPr>
-          <w:ilvl w:val="0"/>
-          <w:numId w:val="2"/>
-        </w:numPr>
-        <w:spacing w:after="100" w:line="290"/>
-      </w:pPr>
-      <w:r>
-        <w:rPr>
-          <w:rFonts w:ascii="Georgia" w:cs="Georgia" w:eastAsia="Georgia" w:hAnsi="Georgia"/>
-          <w:sz w:val="22"/>
-          <w:szCs w:val="22"/>
-        </w:rPr>
-        <w:t xml:space="preserve">Third answer, the genre one: the Gospels do not read like myth. They name a Roman governor, a client king, a high priest, a specific feast, a location outside a specific city gate, and a list of witnesses including women, whose testimony carried little legal weight at the time, which is not what a fabricator invents. Compare the opening of Luke (1:1-4) or 2 Peter 1:16 with the opening of any genuine myth: 'once upon a time' versus 'in the fifteenth year of the reign of Tiberius Caesar.'</w:t>
-      </w:r>
-    </w:p>
-    <w:p>
-      <w:pPr>
-        <w:pStyle w:val="ListParagraph"/>
-        <w:numPr>
-          <w:ilvl w:val="0"/>
-          <w:numId w:val="2"/>
-        </w:numPr>
-        <w:spacing w:after="100" w:line="290"/>
-      </w:pPr>
-      <w:r>
-        <w:rPr>
-          <w:rFonts w:ascii="Georgia" w:cs="Georgia" w:eastAsia="Georgia" w:hAnsi="Georgia"/>
-          <w:sz w:val="22"/>
-          <w:szCs w:val="22"/>
-        </w:rPr>
-        <w:t xml:space="preserve">Fourth answer, the Lewis one, and the most generous: God sent the human race 'good dreams.' (Mere Christianity, and developed in 'Myth Became Fact.') The parallels are not an embarrassment; they are the fingerprints of a Creator preparing the imagination of his creatures for the real thing. Lewis: 'The heart of Christianity is a myth which is also a fact... by becoming fact it does not cease to be myth: that is the miracle.'</w:t>
-      </w:r>
-    </w:p>
-    <w:p>
-      <w:pPr>
-        <w:pStyle w:val="ListParagraph"/>
-        <w:numPr>
-          <w:ilvl w:val="0"/>
-          <w:numId w:val="2"/>
-        </w:numPr>
-        <w:spacing w:after="100" w:line="290"/>
-      </w:pPr>
-      <w:r>
-        <w:rPr>
-          <w:rFonts w:ascii="Georgia" w:cs="Georgia" w:eastAsia="Georgia" w:hAnsi="Georgia"/>
-          <w:sz w:val="22"/>
-          <w:szCs w:val="22"/>
-        </w:rPr>
-        <w:t xml:space="preserve">Fifth answer, the authority one, and the one this course leans on hardest: Genesis is not distinguished from the other flood accounts by being the oldest telling. It is distinguished by who gave it. The accounts of Babylon, Greece, India, and a hundred other peoples are inherited memory, handed down and worn smooth and bent in the handing. Genesis is revelation: what God chose to tell Moses about an event the whole world still half remembered. That is why the age of the tablets was never a threat to it. We are not claiming that Scripture got there first. We are claiming that Scripture is true because the One who was there is the One who told it. Notice what this frees you to do in the room. You can grant the skeptic every date he offers, without hedging and without anxiety, and lose precisely nothing.</w:t>
-      </w:r>
-    </w:p>
-    <w:p>
-      <w:pPr>
-        <w:pStyle w:val="ListParagraph"/>
-        <w:numPr>
-          <w:ilvl w:val="0"/>
-          <w:numId w:val="2"/>
-        </w:numPr>
-        <w:spacing w:after="100" w:line="290"/>
-      </w:pPr>
-      <w:r>
-        <w:rPr>
-          <w:rFonts w:ascii="Georgia" w:cs="Georgia" w:eastAsia="Georgia" w:hAnsi="Georgia"/>
-          <w:sz w:val="22"/>
-          <w:szCs w:val="22"/>
-        </w:rPr>
-        <w:t xml:space="preserve">On Genesis and the flood accounts specifically: the shared memory of a catastrophic flood across many cultures is what you would expect if such an event actually happened and was remembered everywhere, in some places accurately and in others through distortion. Note also that the theology of Genesis is not merely different from the Mesopotamian accounts but pointedly corrective: in Gilgamesh the gods send the flood because humans are noisy and inconvenient; in Genesis the flood is a moral judgment by a righteous God who then binds himself by covenant never to repeat it. Same event remembered; radically different account of who God is.</w:t>
+        <w:t xml:space="preserve">The synthesis: world, self, and Logos</w:t>
+      </w:r>
+    </w:p>
+    <w:p>
+      <w:pPr>
+        <w:pStyle w:val="ListParagraph"/>
+        <w:numPr>
+          <w:ilvl w:val="0"/>
+          <w:numId w:val="2"/>
+        </w:numPr>
+        <w:spacing w:after="100" w:line="290"/>
+      </w:pPr>
+      <w:r>
+        <w:rPr>
+          <w:rFonts w:ascii="Georgia" w:cs="Georgia" w:eastAsia="Georgia" w:hAnsi="Georgia"/>
+          <w:sz w:val="22"/>
+          <w:szCs w:val="22"/>
+        </w:rPr>
+        <w:t xml:space="preserve">This is the argument of the session, and the intellectual engine of the course. It comes in three parts, in the order the slides make them. Pageau: the pattern is in the world, and symbolism is not something the mind paints onto meaningless matter. Peterson: the pattern is in us, which is why human beings recognize these stories and navigate by them. John 1: of course it is in both, because the world and the human being both came through the same Logos. Two observations that look like rivals turn out to be one claim seen from two sides.</w:t>
+      </w:r>
+    </w:p>
+    <w:p>
+      <w:pPr>
+        <w:pStyle w:val="ListParagraph"/>
+        <w:numPr>
+          <w:ilvl w:val="0"/>
+          <w:numId w:val="2"/>
+        </w:numPr>
+        <w:spacing w:after="100" w:line="290"/>
+      </w:pPr>
+      <w:r>
+        <w:rPr>
+          <w:rFonts w:ascii="Georgia" w:cs="Georgia" w:eastAsia="Georgia" w:hAnsi="Georgia"/>
+          <w:sz w:val="22"/>
+          <w:szCs w:val="22"/>
+        </w:rPr>
+        <w:t xml:space="preserve">Keep the order. The room meets the phenomenon first, then the two witnesses, then the explanation. Leading with the explanation turns a discovery into a lecture, and the whole point of the opening hook is that they feel the pattern before anyone names it.</w:t>
+      </w:r>
+    </w:p>
+    <w:p>
+      <w:pPr>
+        <w:pStyle w:val="ListParagraph"/>
+        <w:numPr>
+          <w:ilvl w:val="0"/>
+          <w:numId w:val="2"/>
+        </w:numPr>
+        <w:spacing w:after="100" w:line="290"/>
+      </w:pPr>
+      <w:r>
+        <w:rPr>
+          <w:rFonts w:ascii="Georgia" w:cs="Georgia" w:eastAsia="Georgia" w:hAnsi="Georgia"/>
+          <w:sz w:val="22"/>
+          <w:szCs w:val="22"/>
+        </w:rPr>
+        <w:t xml:space="preserve">The test of the session: can a student summarize it in one sentence? A strong answer is that we keep telling the same kinds of stories because the world and the human heart were made by the same Logos, and Scripture reveals the pattern most clearly. If they leave thinking mainly about Gilgamesh, flood chronology, or comparative mythology, the session drifted.</w:t>
+      </w:r>
+    </w:p>
+    <w:p>
+      <w:pPr>
+        <w:pStyle w:val="ListParagraph"/>
+        <w:numPr>
+          <w:ilvl w:val="0"/>
+          <w:numId w:val="2"/>
+        </w:numPr>
+        <w:spacing w:after="100" w:line="290"/>
+      </w:pPr>
+      <w:r>
+        <w:rPr>
+          <w:rFonts w:ascii="Georgia" w:cs="Georgia" w:eastAsia="Georgia" w:hAnsi="Georgia"/>
+          <w:sz w:val="22"/>
+          <w:szCs w:val="22"/>
+        </w:rPr>
+        <w:t xml:space="preserve">Guides, not authorities, and say so out loud. Pageau is an Orthodox Christian and a brother in Christ from another tradition; we read him the way we read Augustine or Lewis, using his eye for symbolism without importing his tradition's practices. Peterson reaches the pattern from outside the faith, and that is precisely his usefulness as a witness. Scripture remains the measure of both.</w:t>
       </w:r>
     </w:p>
     <w:p>
@@ -1483,61 +1452,146 @@
           <w:sz w:val="26"/>
           <w:szCs w:val="26"/>
         </w:rPr>
-        <w:t xml:space="preserve">The positive claim: hyper-real, not less real</w:t>
-      </w:r>
-    </w:p>
-    <w:p>
-      <w:pPr>
-        <w:pStyle w:val="ListParagraph"/>
-        <w:numPr>
-          <w:ilvl w:val="0"/>
-          <w:numId w:val="2"/>
-        </w:numPr>
-        <w:spacing w:after="100" w:line="290"/>
-      </w:pPr>
-      <w:r>
-        <w:rPr>
-          <w:rFonts w:ascii="Georgia" w:cs="Georgia" w:eastAsia="Georgia" w:hAnsi="Georgia"/>
-          <w:sz w:val="22"/>
-          <w:szCs w:val="22"/>
-        </w:rPr>
-        <w:t xml:space="preserve">The course's formulation, worth saying in these words: everywhere else the pattern is a rumor; in Scripture it has an address. The recurrence of these shapes before and after the biblical events is evidence that the truths are woven into the fabric of reality itself. That makes Scripture not one more story in the pile, but the hinge, the point where the pattern stopped being a rumor and entered history.</w:t>
-      </w:r>
-    </w:p>
-    <w:p>
-      <w:pPr>
-        <w:pStyle w:val="ListParagraph"/>
-        <w:numPr>
-          <w:ilvl w:val="0"/>
-          <w:numId w:val="2"/>
-        </w:numPr>
-        <w:spacing w:after="100" w:line="290"/>
-      </w:pPr>
-      <w:r>
-        <w:rPr>
-          <w:rFonts w:ascii="Georgia" w:cs="Georgia" w:eastAsia="Georgia" w:hAnsi="Georgia"/>
-          <w:sz w:val="22"/>
-          <w:szCs w:val="22"/>
-        </w:rPr>
-        <w:t xml:space="preserve">A useful image if the room is analytical: gravity was true before Newton and is still true after him, and the fact that many cultures noticed things fall does not make Newton derivative. It makes the phenomenon real. The myths noticed that things fall; Scripture reports the day the Author himself fell into the world.</w:t>
-      </w:r>
-    </w:p>
-    <w:p>
-      <w:pPr>
-        <w:pStyle w:val="ListParagraph"/>
-        <w:numPr>
-          <w:ilvl w:val="0"/>
-          <w:numId w:val="2"/>
-        </w:numPr>
-        <w:spacing w:after="100" w:line="290"/>
-      </w:pPr>
-      <w:r>
-        <w:rPr>
-          <w:rFonts w:ascii="Georgia" w:cs="Georgia" w:eastAsia="Georgia" w:hAnsi="Georgia"/>
-          <w:sz w:val="22"/>
-          <w:szCs w:val="22"/>
-        </w:rPr>
-        <w:t xml:space="preserve">Guard the edges in both directions. Do not let the class conclude that the myths are worthless (they are good dreams, and Paul quotes them), and do not let them conclude that Scripture is merely the best myth (it is testimony to events). The course holds both: the stories are true-ish echoes; the gospel is a true report.</w:t>
+        <w:t xml:space="preserve">The derivation objection, if it comes up</w:t>
+      </w:r>
+    </w:p>
+    <w:p>
+      <w:pPr>
+        <w:spacing w:after="160" w:line="300"/>
+      </w:pPr>
+      <w:r>
+        <w:rPr>
+          <w:rFonts w:ascii="Georgia" w:cs="Georgia" w:eastAsia="Georgia" w:hAnsi="Georgia"/>
+          <w:sz w:val="22"/>
+          <w:szCs w:val="22"/>
+        </w:rPr>
+        <w:t xml:space="preserve">Slides 12 and 13 carry the guardrail in two short movements, and that is all the session spends on this. The material below is your reserve, for a question in the room or a conversation afterward. Know it well enough to answer conversationally and briefly. Do not teach it from the front unless someone asks, and if the questions keep coming, offer to stay after rather than letting the objection take the hour.</w:t>
+      </w:r>
+    </w:p>
+    <w:p>
+      <w:pPr>
+        <w:pStyle w:val="ListParagraph"/>
+        <w:numPr>
+          <w:ilvl w:val="0"/>
+          <w:numId w:val="2"/>
+        </w:numPr>
+        <w:spacing w:after="100" w:line="290"/>
+      </w:pPr>
+      <w:r>
+        <w:rPr>
+          <w:rFonts w:ascii="Georgia" w:cs="Georgia" w:eastAsia="Georgia" w:hAnsi="Georgia"/>
+          <w:sz w:val="22"/>
+          <w:szCs w:val="22"/>
+        </w:rPr>
+        <w:t xml:space="preserve">The objection in its popular form: Genesis borrowed its flood from Gilgamesh; the resurrection borrowed from Osiris, Adonis, Attis, Mithras, Dionysus; therefore Christianity is a late remix of pagan material. It circulates constantly online and in documentaries.</w:t>
+      </w:r>
+    </w:p>
+    <w:p>
+      <w:pPr>
+        <w:pStyle w:val="ListParagraph"/>
+        <w:numPr>
+          <w:ilvl w:val="0"/>
+          <w:numId w:val="2"/>
+        </w:numPr>
+        <w:spacing w:after="100" w:line="290"/>
+      </w:pPr>
+      <w:r>
+        <w:rPr>
+          <w:rFonts w:ascii="Georgia" w:cs="Georgia" w:eastAsia="Georgia" w:hAnsi="Georgia"/>
+          <w:sz w:val="22"/>
+          <w:szCs w:val="22"/>
+        </w:rPr>
+        <w:t xml:space="preserve">First answer, the logical one: chronology of tellings is not chronology of truth. That an idea was voiced before an event does not mean the event did not happen. Rumors of a king precede a coronation; sketches precede a portrait; an echo does not create the sound. If God built reality with a certain shape, we should expect humans made in his image to keep sketching that shape long before and long after the events.</w:t>
+      </w:r>
+    </w:p>
+    <w:p>
+      <w:pPr>
+        <w:pStyle w:val="ListParagraph"/>
+        <w:numPr>
+          <w:ilvl w:val="0"/>
+          <w:numId w:val="2"/>
+        </w:numPr>
+        <w:spacing w:after="100" w:line="290"/>
+      </w:pPr>
+      <w:r>
+        <w:rPr>
+          <w:rFonts w:ascii="Georgia" w:cs="Georgia" w:eastAsia="Georgia" w:hAnsi="Georgia"/>
+          <w:sz w:val="22"/>
+          <w:szCs w:val="22"/>
+        </w:rPr>
+        <w:t xml:space="preserve">Second answer, the evidential one: the alleged parallels are routinely overstated. Serious scholarship, including work by non-Christians (Jonathan Z. Smith's critique of the 'dying and rising gods' category is the standard reference; also relevant is the collapse of the older Frazer/Golden Bough synthesis), has shown that most of these figures do not actually die and rise in anything like the Christian sense; several 'parallels' derive from post-Christian sources or from loose paraphrase. Encourage anyone pressing this to check primary sources rather than internet lists. You need not be combative; just note that the parallels tend to shrink dramatically under examination.</w:t>
+      </w:r>
+    </w:p>
+    <w:p>
+      <w:pPr>
+        <w:pStyle w:val="ListParagraph"/>
+        <w:numPr>
+          <w:ilvl w:val="0"/>
+          <w:numId w:val="2"/>
+        </w:numPr>
+        <w:spacing w:after="100" w:line="290"/>
+      </w:pPr>
+      <w:r>
+        <w:rPr>
+          <w:rFonts w:ascii="Georgia" w:cs="Georgia" w:eastAsia="Georgia" w:hAnsi="Georgia"/>
+          <w:sz w:val="22"/>
+          <w:szCs w:val="22"/>
+        </w:rPr>
+        <w:t xml:space="preserve">Third answer, the genre one: the Gospels do not read like myth. They name a Roman governor, a client king, a high priest, a specific feast, a location outside a specific city gate, and a list of witnesses including women, whose testimony carried little legal weight at the time, which is not what a fabricator invents. Compare the opening of Luke (1:1-4) or 2 Peter 1:16 with the opening of any genuine myth: 'once upon a time' versus 'in the fifteenth year of the reign of Tiberius Caesar.'</w:t>
+      </w:r>
+    </w:p>
+    <w:p>
+      <w:pPr>
+        <w:pStyle w:val="ListParagraph"/>
+        <w:numPr>
+          <w:ilvl w:val="0"/>
+          <w:numId w:val="2"/>
+        </w:numPr>
+        <w:spacing w:after="100" w:line="290"/>
+      </w:pPr>
+      <w:r>
+        <w:rPr>
+          <w:rFonts w:ascii="Georgia" w:cs="Georgia" w:eastAsia="Georgia" w:hAnsi="Georgia"/>
+          <w:sz w:val="22"/>
+          <w:szCs w:val="22"/>
+        </w:rPr>
+        <w:t xml:space="preserve">Fourth answer, the Lewis one, and the most generous: God sent the human race 'good dreams.' (Mere Christianity, and developed in 'Myth Became Fact.') The parallels are not an embarrassment; they are the fingerprints of a Creator preparing the imagination of his creatures for the real thing. Lewis: 'The heart of Christianity is a myth which is also a fact... by becoming fact it does not cease to be myth: that is the miracle.'</w:t>
+      </w:r>
+    </w:p>
+    <w:p>
+      <w:pPr>
+        <w:pStyle w:val="ListParagraph"/>
+        <w:numPr>
+          <w:ilvl w:val="0"/>
+          <w:numId w:val="2"/>
+        </w:numPr>
+        <w:spacing w:after="100" w:line="290"/>
+      </w:pPr>
+      <w:r>
+        <w:rPr>
+          <w:rFonts w:ascii="Georgia" w:cs="Georgia" w:eastAsia="Georgia" w:hAnsi="Georgia"/>
+          <w:sz w:val="22"/>
+          <w:szCs w:val="22"/>
+        </w:rPr>
+        <w:t xml:space="preserve">Fifth answer, the authority one, and the one this course leans on hardest: Genesis is not distinguished from the other flood accounts by being the oldest telling. It is distinguished by who gave it. The accounts of Babylon, Greece, India, and a hundred other peoples are inherited memory, handed down and worn smooth and bent in the handing. Genesis is revelation: what God chose to tell Moses about an event the whole world still half remembered. That is why the age of the tablets was never a threat to it. We are not claiming that Scripture got there first. We are claiming that Scripture is true because the One who was there is the One who told it. Notice what this frees you to do in the room. You can grant the skeptic every date he offers, without hedging and without anxiety, and lose precisely nothing.</w:t>
+      </w:r>
+    </w:p>
+    <w:p>
+      <w:pPr>
+        <w:pStyle w:val="ListParagraph"/>
+        <w:numPr>
+          <w:ilvl w:val="0"/>
+          <w:numId w:val="2"/>
+        </w:numPr>
+        <w:spacing w:after="100" w:line="290"/>
+      </w:pPr>
+      <w:r>
+        <w:rPr>
+          <w:rFonts w:ascii="Georgia" w:cs="Georgia" w:eastAsia="Georgia" w:hAnsi="Georgia"/>
+          <w:sz w:val="22"/>
+          <w:szCs w:val="22"/>
+        </w:rPr>
+        <w:t xml:space="preserve">On Genesis and the flood accounts specifically: the shared memory of a catastrophic flood across many cultures is what you would expect if such an event actually happened and was remembered everywhere, in some places accurately and in others through distortion. Note also that the theology of Genesis is not merely different from the Mesopotamian accounts but pointedly corrective: in Gilgamesh the gods send the flood because humans are noisy and inconvenient; in Genesis the flood is a moral judgment by a righteous God who then binds himself by covenant never to repeat it. Same event remembered; radically different account of who God is.</w:t>
       </w:r>
     </w:p>
     <w:p>
@@ -1554,61 +1608,61 @@
           <w:sz w:val="26"/>
           <w:szCs w:val="26"/>
         </w:rPr>
-        <w:t xml:space="preserve">Who these two are, and why the class listens to them</w:t>
-      </w:r>
-    </w:p>
-    <w:p>
-      <w:pPr>
-        <w:pStyle w:val="ListParagraph"/>
-        <w:numPr>
-          <w:ilvl w:val="0"/>
-          <w:numId w:val="2"/>
-        </w:numPr>
-        <w:spacing w:after="100" w:line="290"/>
-      </w:pPr>
-      <w:r>
-        <w:rPr>
-          <w:rFonts w:ascii="Georgia" w:cs="Georgia" w:eastAsia="Georgia" w:hAnsi="Georgia"/>
-          <w:sz w:val="22"/>
-          <w:szCs w:val="22"/>
-        </w:rPr>
-        <w:t xml:space="preserve">Jonathan Pageau is a French Canadian icon carver and the maker of The Symbolic World, where he argues that reality is patterned and that the pattern repeats at every scale: what holds for a body holds for a household, a city, a kingdom, and the cosmos. His categories run through this whole course, heaven and earth, center and periphery, order and chaos, and the margin that keeps becoming the center. He is an Eastern Orthodox Christian, and the class says so out loud rather than quietly borrowing from him. Where his tradition's practice would be foreign to this room we do not import it; where his eye for symbolism opens up the text, we use him the way we use Augustine or Lewis.</w:t>
-      </w:r>
-    </w:p>
-    <w:p>
-      <w:pPr>
-        <w:pStyle w:val="ListParagraph"/>
-        <w:numPr>
-          <w:ilvl w:val="0"/>
-          <w:numId w:val="2"/>
-        </w:numPr>
-        <w:spacing w:after="100" w:line="290"/>
-      </w:pPr>
-      <w:r>
-        <w:rPr>
-          <w:rFonts w:ascii="Georgia" w:cs="Georgia" w:eastAsia="Georgia" w:hAnsi="Georgia"/>
-          <w:sz w:val="22"/>
-          <w:szCs w:val="22"/>
-        </w:rPr>
-        <w:t xml:space="preserve">Jordan Peterson is a clinical psychologist and former professor whose Maps of Meaning: The Architecture of Belief argues that human beings navigate between the known and the unknown by means of archetypal story, and that the map is survival equipment rather than decoration. He has also lectured at length on Genesis and Exodus, with more seriousness than many of his critics expect. Where he stands personally with respect to Christian faith is something he has spoken about publicly in ways that have shifted over the years, and it is not this class's business to settle. Say so plainly if you are asked, and then say the thing that actually matters: the course does not rest on his profession of faith either way, and if it did he would not be worth citing. His usefulness here is precisely that he reaches the pattern from outside it.</w:t>
-      </w:r>
-    </w:p>
-    <w:p>
-      <w:pPr>
-        <w:pStyle w:val="ListParagraph"/>
-        <w:numPr>
-          <w:ilvl w:val="0"/>
-          <w:numId w:val="2"/>
-        </w:numPr>
-        <w:spacing w:after="100" w:line="290"/>
-      </w:pPr>
-      <w:r>
-        <w:rPr>
-          <w:rFonts w:ascii="Georgia" w:cs="Georgia" w:eastAsia="Georgia" w:hAnsi="Georgia"/>
-          <w:sz w:val="22"/>
-          <w:szCs w:val="22"/>
-        </w:rPr>
-        <w:t xml:space="preserve">Why name them at all. The argument of this course does not depend on either man. The patterns are visible in the stories the room already loves, and Scripture is the authority. So every mention of them in the remaining sessions is doing one of two jobs: corroborating the claim from outside the faith, or handing you a lens that makes visible something you would otherwise walk past. If you ever catch yourself dropping a name for any other reason, drop the name and keep the idea. That is a habit worth teaching by example.</w:t>
+        <w:t xml:space="preserve">The positive claim: hyper-real, not less real</w:t>
+      </w:r>
+    </w:p>
+    <w:p>
+      <w:pPr>
+        <w:pStyle w:val="ListParagraph"/>
+        <w:numPr>
+          <w:ilvl w:val="0"/>
+          <w:numId w:val="2"/>
+        </w:numPr>
+        <w:spacing w:after="100" w:line="290"/>
+      </w:pPr>
+      <w:r>
+        <w:rPr>
+          <w:rFonts w:ascii="Georgia" w:cs="Georgia" w:eastAsia="Georgia" w:hAnsi="Georgia"/>
+          <w:sz w:val="22"/>
+          <w:szCs w:val="22"/>
+        </w:rPr>
+        <w:t xml:space="preserve">The course's formulation, worth saying in these words: everywhere else the pattern is a rumor; in Scripture it has an address. The recurrence of these shapes before and after the biblical events is evidence that the truths are woven into the fabric of reality itself. That makes Scripture not one more story in the pile, but the hinge, the point where the pattern stopped being a rumor and entered history. Slide 12 states it as the guardrail: pattern is not the opposite of history.</w:t>
+      </w:r>
+    </w:p>
+    <w:p>
+      <w:pPr>
+        <w:pStyle w:val="ListParagraph"/>
+        <w:numPr>
+          <w:ilvl w:val="0"/>
+          <w:numId w:val="2"/>
+        </w:numPr>
+        <w:spacing w:after="100" w:line="290"/>
+      </w:pPr>
+      <w:r>
+        <w:rPr>
+          <w:rFonts w:ascii="Georgia" w:cs="Georgia" w:eastAsia="Georgia" w:hAnsi="Georgia"/>
+          <w:sz w:val="22"/>
+          <w:szCs w:val="22"/>
+        </w:rPr>
+        <w:t xml:space="preserve">A useful image if the room is analytical: gravity was true before Newton and is still true after him, and the fact that many cultures noticed things fall does not make Newton derivative. It makes the phenomenon real. The myths noticed that things fall; Scripture reports the day the Author himself fell into the world.</w:t>
+      </w:r>
+    </w:p>
+    <w:p>
+      <w:pPr>
+        <w:pStyle w:val="ListParagraph"/>
+        <w:numPr>
+          <w:ilvl w:val="0"/>
+          <w:numId w:val="2"/>
+        </w:numPr>
+        <w:spacing w:after="100" w:line="290"/>
+      </w:pPr>
+      <w:r>
+        <w:rPr>
+          <w:rFonts w:ascii="Georgia" w:cs="Georgia" w:eastAsia="Georgia" w:hAnsi="Georgia"/>
+          <w:sz w:val="22"/>
+          <w:szCs w:val="22"/>
+        </w:rPr>
+        <w:t xml:space="preserve">Guard the edges in both directions. Do not let the class conclude that the myths are worthless (they are good dreams, and Paul quotes them), and do not let them conclude that Scripture is merely the best myth (it is testimony to events). The course holds both: the stories are true-ish echoes; the gospel is a true report.</w:t>
       </w:r>
     </w:p>
     <w:p>
@@ -1625,6 +1679,77 @@
           <w:sz w:val="26"/>
           <w:szCs w:val="26"/>
         </w:rPr>
+        <w:t xml:space="preserve">Who these two are, and why the class listens to them</w:t>
+      </w:r>
+    </w:p>
+    <w:p>
+      <w:pPr>
+        <w:pStyle w:val="ListParagraph"/>
+        <w:numPr>
+          <w:ilvl w:val="0"/>
+          <w:numId w:val="2"/>
+        </w:numPr>
+        <w:spacing w:after="100" w:line="290"/>
+      </w:pPr>
+      <w:r>
+        <w:rPr>
+          <w:rFonts w:ascii="Georgia" w:cs="Georgia" w:eastAsia="Georgia" w:hAnsi="Georgia"/>
+          <w:sz w:val="22"/>
+          <w:szCs w:val="22"/>
+        </w:rPr>
+        <w:t xml:space="preserve">Jonathan Pageau is a French Canadian icon carver and the maker of The Symbolic World, where he argues that reality is patterned and that the pattern repeats at every scale: what holds for a body holds for a household, a city, a kingdom, and the cosmos. His categories run through this whole course, heaven and earth, center and periphery, order and chaos, and the margin that keeps becoming the center. He is an Eastern Orthodox Christian, and the class says so out loud rather than quietly borrowing from him. Where his tradition's practice would be foreign to this room we do not import it; where his eye for symbolism opens up the text, we use him the way we use Augustine or Lewis.</w:t>
+      </w:r>
+    </w:p>
+    <w:p>
+      <w:pPr>
+        <w:pStyle w:val="ListParagraph"/>
+        <w:numPr>
+          <w:ilvl w:val="0"/>
+          <w:numId w:val="2"/>
+        </w:numPr>
+        <w:spacing w:after="100" w:line="290"/>
+      </w:pPr>
+      <w:r>
+        <w:rPr>
+          <w:rFonts w:ascii="Georgia" w:cs="Georgia" w:eastAsia="Georgia" w:hAnsi="Georgia"/>
+          <w:sz w:val="22"/>
+          <w:szCs w:val="22"/>
+        </w:rPr>
+        <w:t xml:space="preserve">Jordan Peterson is a clinical psychologist and former professor whose Maps of Meaning: The Architecture of Belief argues that human beings navigate between the known and the unknown by means of archetypal story, and that the map is survival equipment rather than decoration. He has also lectured at length on Genesis and Exodus, with more seriousness than many of his critics expect. Where he stands personally with respect to Christian faith is something he has spoken about publicly in ways that have shifted over the years, and it is not this class's business to settle. Say so plainly if you are asked, and then say the thing that actually matters: the course does not rest on his profession of faith either way, and if it did he would not be worth citing. His usefulness here is precisely that he reaches the pattern from outside it.</w:t>
+      </w:r>
+    </w:p>
+    <w:p>
+      <w:pPr>
+        <w:pStyle w:val="ListParagraph"/>
+        <w:numPr>
+          <w:ilvl w:val="0"/>
+          <w:numId w:val="2"/>
+        </w:numPr>
+        <w:spacing w:after="100" w:line="290"/>
+      </w:pPr>
+      <w:r>
+        <w:rPr>
+          <w:rFonts w:ascii="Georgia" w:cs="Georgia" w:eastAsia="Georgia" w:hAnsi="Georgia"/>
+          <w:sz w:val="22"/>
+          <w:szCs w:val="22"/>
+        </w:rPr>
+        <w:t xml:space="preserve">Why name them at all. The argument of this course does not depend on either man. The patterns are visible in the stories the room already loves, and Scripture is the authority. So every mention of them in the remaining sessions is doing one of two jobs: corroborating the claim from outside the faith, or handing you a lens that makes visible something you would otherwise walk past. If you ever catch yourself dropping a name for any other reason, drop the name and keep the idea. That is a habit worth teaching by example.</w:t>
+      </w:r>
+    </w:p>
+    <w:p>
+      <w:pPr>
+        <w:pStyle w:val="Heading2"/>
+        <w:spacing w:after="120" w:before="280"/>
+      </w:pPr>
+      <w:r>
+        <w:rPr>
+          <w:rFonts w:ascii="Georgia" w:cs="Georgia" w:eastAsia="Georgia" w:hAnsi="Georgia"/>
+          <w:b/>
+          <w:bCs/>
+          <w:color w:val="B8860B"/>
+          <w:sz w:val="26"/>
+          <w:szCs w:val="26"/>
+        </w:rPr>
         <w:t xml:space="preserve">The other sources behind this session</w:t>
       </w:r>
     </w:p>
@@ -1722,7 +1847,7 @@
           <w:sz w:val="22"/>
           <w:szCs w:val="22"/>
         </w:rPr>
-        <w:t xml:space="preserve">Some in the room may be carrying real doubt, perhaps a student whose professor or favorite podcaster made the derivation argument and left a splinter behind. Do not treat the objection as an attack to be repelled; treat it as a good question with a good answer. The tone you want: 'That is a serious objection, it has a serious answer, and the answer makes the faith bigger rather than smaller.' Offer to talk afterward with anyone who wants the sources; several are listed above.</w:t>
+        <w:t xml:space="preserve">Some in the room may be carrying real doubt, perhaps a student whose professor or favorite podcaster made the derivation argument and left a splinter behind. This session answers it in two slides rather than six, which is deliberate, and a student who came in braced for a fight may need you to say the answer out loud to them afterward. Do not treat the objection as an attack to be repelled; treat it as a good question with a good answer. The tone you want: 'That is a serious objection, it has a serious answer, and the answer makes the faith bigger rather than smaller.' Offer to talk afterward with anyone who wants the sources; several are listed above.</w:t>
       </w:r>
     </w:p>
     <w:p>

</xml_diff>